<commit_message>
docs: refresh thesis final docx
</commit_message>
<xml_diff>
--- a/.docs/论文/面向编程竞赛的SpringBoot在线算法题库系统的设计与实现论文——汪鸿韬(终稿).docx
+++ b/.docs/论文/面向编程竞赛的SpringBoot在线算法题库系统的设计与实现论文——汪鸿韬(终稿).docx
@@ -9602,10 +9602,11 @@
         <w:rPr>
           <w:noProof/>
         </w:rPr>
+        <w:lastRenderedPageBreak/>
         <w:drawing>
-          <wp:inline distT="0" distB="0" distL="0" distR="0" wp14:anchorId="40834925" wp14:editId="0799E005">
-            <wp:extent cx="4825365" cy="3040380"/>
-            <wp:effectExtent l="0" t="0" r="0" b="0"/>
+          <wp:inline distT="0" distB="0" distL="0" distR="0" wp14:anchorId="40834925" wp14:editId="01377A4F">
+            <wp:extent cx="5016234" cy="3160643"/>
+            <wp:effectExtent l="0" t="0" r="0" b="1905"/>
             <wp:docPr id="5" name="图片 5"/>
             <wp:cNvGraphicFramePr>
               <a:graphicFrameLocks xmlns:a="http://schemas.openxmlformats.org/drawingml/2006/main" noChangeAspect="1"/>
@@ -9635,7 +9636,7 @@
                   <pic:spPr bwMode="auto">
                     <a:xfrm>
                       <a:off x="0" y="0"/>
-                      <a:ext cx="4825365" cy="3040380"/>
+                      <a:ext cx="5019766" cy="3162868"/>
                     </a:xfrm>
                     <a:prstGeom prst="rect">
                       <a:avLst/>
@@ -9666,7 +9667,6 @@
           <w:sz w:val="21"/>
           <w:szCs w:val="21"/>
         </w:rPr>
-        <w:lastRenderedPageBreak/>
         <w:t>图</w:t>
       </w:r>
       <w:r>
@@ -9842,7 +9842,11 @@
         <w:jc w:val="left"/>
       </w:pPr>
       <w:r>
-        <w:t>数据字典中包含数据源、数据流、数据存储和数据加工等内容，通过数据字典可以明确系统与用户、管理员、判题环境和数据库之间的数据走向及处理情况。</w:t>
+        <w:t>数据字典中包含数据源、数据流、数据存储和数据加工等内容，通过数据字</w:t>
+      </w:r>
+      <w:r>
+        <w:lastRenderedPageBreak/>
+        <w:t>典可以明确系统与用户、管理员、判题环境和数据库之间的数据走向及处理情况。</w:t>
       </w:r>
     </w:p>
     <w:p>
@@ -10296,7 +10300,6 @@
               <w:rPr>
                 <w:sz w:val="21"/>
               </w:rPr>
-              <w:lastRenderedPageBreak/>
               <w:t>4</w:t>
             </w:r>
           </w:p>
@@ -11790,7 +11793,14 @@
               <w:rPr>
                 <w:sz w:val="21"/>
               </w:rPr>
-              <w:t>、题号、标题、难度、题面、限制、状态</w:t>
+              <w:t>、题号、标题、难度、</w:t>
+            </w:r>
+            <w:r>
+              <w:rPr>
+                <w:sz w:val="21"/>
+              </w:rPr>
+              <w:lastRenderedPageBreak/>
+              <w:t>题面、限制、状态</w:t>
             </w:r>
           </w:p>
         </w:tc>
@@ -11811,7 +11821,15 @@
               <w:rPr>
                 <w:sz w:val="21"/>
               </w:rPr>
-              <w:t>题库查询、题目详情、题目维护</w:t>
+              <w:lastRenderedPageBreak/>
+              <w:t>题库查询、题目</w:t>
+            </w:r>
+            <w:r>
+              <w:rPr>
+                <w:sz w:val="21"/>
+              </w:rPr>
+              <w:lastRenderedPageBreak/>
+              <w:t>详情、题目维护</w:t>
             </w:r>
           </w:p>
         </w:tc>
@@ -11837,6 +11855,7 @@
               <w:rPr>
                 <w:sz w:val="21"/>
               </w:rPr>
+              <w:lastRenderedPageBreak/>
               <w:t>3</w:t>
             </w:r>
           </w:p>
@@ -12629,18 +12648,6 @@
         <w:rPr>
           <w:rFonts w:eastAsia="黑体"/>
           <w:sz w:val="21"/>
-          <w:szCs w:val="21"/>
-        </w:rPr>
-      </w:pPr>
-    </w:p>
-    <w:p>
-      <w:pPr>
-        <w:keepNext/>
-        <w:keepLines/>
-        <w:jc w:val="center"/>
-        <w:rPr>
-          <w:rFonts w:eastAsia="黑体"/>
-          <w:sz w:val="21"/>
         </w:rPr>
       </w:pPr>
       <w:r>
@@ -12649,15 +12656,6 @@
           <w:sz w:val="21"/>
           <w:szCs w:val="21"/>
         </w:rPr>
-        <w:br w:type="page"/>
-      </w:r>
-      <w:r>
-        <w:rPr>
-          <w:rFonts w:eastAsia="黑体"/>
-          <w:sz w:val="21"/>
-          <w:szCs w:val="21"/>
-        </w:rPr>
-        <w:lastRenderedPageBreak/>
         <w:t>表</w:t>
       </w:r>
       <w:r>
@@ -14142,8 +14140,8 @@
           <w:noProof/>
         </w:rPr>
         <w:drawing>
-          <wp:inline distT="0" distB="0" distL="0" distR="0" wp14:anchorId="5605E6A1" wp14:editId="3B6D81CF">
-            <wp:extent cx="4935855" cy="3260725"/>
+          <wp:inline distT="0" distB="0" distL="0" distR="0" wp14:anchorId="5605E6A1" wp14:editId="20C98AB9">
+            <wp:extent cx="4711148" cy="3112279"/>
             <wp:effectExtent l="0" t="0" r="0" b="0"/>
             <wp:docPr id="9" name="图片 9"/>
             <wp:cNvGraphicFramePr>
@@ -14174,7 +14172,7 @@
                   <pic:spPr bwMode="auto">
                     <a:xfrm>
                       <a:off x="0" y="0"/>
-                      <a:ext cx="4935855" cy="3260725"/>
+                      <a:ext cx="4719206" cy="3117602"/>
                     </a:xfrm>
                     <a:prstGeom prst="rect">
                       <a:avLst/>
@@ -14205,7 +14203,6 @@
           <w:sz w:val="21"/>
           <w:szCs w:val="21"/>
         </w:rPr>
-        <w:lastRenderedPageBreak/>
         <w:t>图</w:t>
       </w:r>
       <w:r>
@@ -14232,6 +14229,7 @@
         <w:jc w:val="left"/>
       </w:pPr>
       <w:r>
+        <w:lastRenderedPageBreak/>
         <w:t>（</w:t>
       </w:r>
       <w:r>
@@ -18584,13 +18582,43 @@
     <w:p>
       <w:pPr>
         <w:jc w:val="center"/>
-      </w:pPr>
-      <w:r>
         <w:rPr>
           <w:rFonts w:eastAsia="黑体"/>
           <w:sz w:val="21"/>
           <w:szCs w:val="21"/>
         </w:rPr>
+      </w:pPr>
+    </w:p>
+    <w:p>
+      <w:pPr>
+        <w:widowControl/>
+        <w:jc w:val="left"/>
+        <w:rPr>
+          <w:rFonts w:eastAsia="黑体"/>
+          <w:sz w:val="21"/>
+          <w:szCs w:val="21"/>
+        </w:rPr>
+      </w:pPr>
+      <w:r>
+        <w:rPr>
+          <w:rFonts w:eastAsia="黑体"/>
+          <w:sz w:val="21"/>
+          <w:szCs w:val="21"/>
+        </w:rPr>
+        <w:br w:type="page"/>
+      </w:r>
+    </w:p>
+    <w:p>
+      <w:pPr>
+        <w:jc w:val="center"/>
+      </w:pPr>
+      <w:r>
+        <w:rPr>
+          <w:rFonts w:eastAsia="黑体"/>
+          <w:sz w:val="21"/>
+          <w:szCs w:val="21"/>
+        </w:rPr>
+        <w:lastRenderedPageBreak/>
         <w:t>表</w:t>
       </w:r>
       <w:r>
@@ -18795,7 +18823,6 @@
               <w:rPr>
                 <w:sz w:val="21"/>
               </w:rPr>
-              <w:lastRenderedPageBreak/>
               <w:t>user_id</w:t>
             </w:r>
             <w:proofErr w:type="spellEnd"/>

</xml_diff>